<commit_message>
final draft not done fully
</commit_message>
<xml_diff>
--- a/ePortfolio/assets/assets/Resume1.docx
+++ b/ePortfolio/assets/assets/Resume1.docx
@@ -475,254 +475,8 @@
           <w:ilvl w:val="0"/>
           <w:numId w:val="0"/>
         </w:numPr>
-        <w:ind w:left="360" w:hanging="360"/>
+        <w:ind w:left="0" w:hanging="0"/>
       </w:pPr>
-      <w:r>
-        <w:t>EXAMPLE COPYWRITES</w:t>
-      </w:r>
-      <w:r>
-        <w:t>:</w:t>
-      </w:r>
-    </w:p>
-    <w:p>
-      <w:pPr>
-        <w:pStyle w:val="ListBullet"/>
-        <w:numPr>
-          <w:ilvl w:val="0"/>
-          <w:numId w:val="0"/>
-        </w:numPr>
-        <w:ind w:left="360" w:hanging="360"/>
-      </w:pPr>
-    </w:p>
-    <w:p>
-      <w:pPr>
-        <w:pStyle w:val="ListBullet"/>
-        <w:numPr>
-          <w:ilvl w:val="0"/>
-          <w:numId w:val="0"/>
-        </w:numPr>
-        <w:ind w:left="360" w:hanging="360"/>
-      </w:pPr>
-      <w:r>
-        <w:t xml:space="preserve">Kundalini Yoga the </w:t>
-      </w:r>
-      <w:r>
-        <w:t>5,000 year old tradition</w:t>
-      </w:r>
-    </w:p>
-    <w:p>
-      <w:pPr>
-        <w:pStyle w:val="ListBullet"/>
-        <w:numPr>
-          <w:ilvl w:val="0"/>
-          <w:numId w:val="0"/>
-        </w:numPr>
-        <w:ind w:left="360" w:hanging="360"/>
-      </w:pPr>
-      <w:r>
-        <w:t xml:space="preserve">Come experience what its like to feel the </w:t>
-      </w:r>
-      <w:r>
-        <w:t xml:space="preserve">shakti-energy </w:t>
-      </w:r>
-    </w:p>
-    <w:p>
-      <w:pPr>
-        <w:pStyle w:val="ListBullet"/>
-        <w:numPr>
-          <w:ilvl w:val="0"/>
-          <w:numId w:val="0"/>
-        </w:numPr>
-        <w:ind w:left="360" w:hanging="360"/>
-      </w:pPr>
-      <w:r>
-        <w:t xml:space="preserve">Inside your body. 30$ a class will get you </w:t>
-      </w:r>
-      <w:r>
-        <w:t xml:space="preserve">into </w:t>
-      </w:r>
-    </w:p>
-    <w:p>
-      <w:pPr>
-        <w:pStyle w:val="ListBullet"/>
-        <w:numPr>
-          <w:ilvl w:val="0"/>
-          <w:numId w:val="0"/>
-        </w:numPr>
-        <w:ind w:left="360" w:hanging="360"/>
-      </w:pPr>
-      <w:r>
-        <w:t>Kundalini Yoga the potent</w:t>
-      </w:r>
-      <w:r>
-        <w:t xml:space="preserve"> snake </w:t>
-      </w:r>
-      <w:r>
-        <w:t>charmer.</w:t>
-      </w:r>
-      <w:r>
-        <w:tab/>
-      </w:r>
-    </w:p>
-    <w:p>
-      <w:pPr>
-        <w:pStyle w:val="ListBullet"/>
-        <w:numPr>
-          <w:ilvl w:val="0"/>
-          <w:numId w:val="0"/>
-        </w:numPr>
-        <w:ind w:left="360" w:hanging="360"/>
-      </w:pPr>
-    </w:p>
-    <w:p>
-      <w:pPr>
-        <w:pStyle w:val="ListBullet"/>
-        <w:numPr>
-          <w:ilvl w:val="0"/>
-          <w:numId w:val="0"/>
-        </w:numPr>
-        <w:ind w:left="360" w:hanging="360"/>
-      </w:pPr>
-      <w:r>
-        <w:t xml:space="preserve">Cbd is a potent and powerful chemical that </w:t>
-      </w:r>
-    </w:p>
-    <w:p>
-      <w:pPr>
-        <w:pStyle w:val="ListBullet"/>
-        <w:numPr>
-          <w:ilvl w:val="0"/>
-          <w:numId w:val="0"/>
-        </w:numPr>
-        <w:ind w:left="360" w:hanging="360"/>
-      </w:pPr>
-      <w:r>
-        <w:t xml:space="preserve">Can have a magical effect for some consumers. </w:t>
-      </w:r>
-    </w:p>
-    <w:p>
-      <w:pPr>
-        <w:pStyle w:val="ListBullet"/>
-        <w:numPr>
-          <w:ilvl w:val="0"/>
-          <w:numId w:val="0"/>
-        </w:numPr>
-        <w:ind w:left="360" w:hanging="360"/>
-      </w:pPr>
-      <w:r>
-        <w:t>Cbd is 100% plant based and natural</w:t>
-      </w:r>
-      <w:r>
-        <w:t>, usually organic</w:t>
-      </w:r>
-    </w:p>
-    <w:p>
-      <w:pPr>
-        <w:pStyle w:val="ListBullet"/>
-        <w:numPr>
-          <w:ilvl w:val="0"/>
-          <w:numId w:val="0"/>
-        </w:numPr>
-        <w:ind w:left="360" w:hanging="360"/>
-      </w:pPr>
-      <w:r>
-        <w:t xml:space="preserve">And </w:t>
-      </w:r>
-      <w:r>
-        <w:t>can alleviate anxiety. Women like to use this product</w:t>
-      </w:r>
-    </w:p>
-    <w:p>
-      <w:pPr>
-        <w:pStyle w:val="ListBullet"/>
-        <w:numPr>
-          <w:ilvl w:val="0"/>
-          <w:numId w:val="0"/>
-        </w:numPr>
-        <w:ind w:left="360" w:hanging="360"/>
-      </w:pPr>
-      <w:r>
-        <w:t>When its that time of the month</w:t>
-      </w:r>
-      <w:r>
-        <w:t xml:space="preserve">. </w:t>
-      </w:r>
-    </w:p>
-    <w:p>
-      <w:pPr>
-        <w:pStyle w:val="ListBullet"/>
-        <w:numPr>
-          <w:ilvl w:val="0"/>
-          <w:numId w:val="0"/>
-        </w:numPr>
-        <w:ind w:left="360" w:hanging="360"/>
-      </w:pPr>
-    </w:p>
-    <w:p>
-      <w:pPr>
-        <w:pStyle w:val="ListBullet"/>
-        <w:numPr>
-          <w:ilvl w:val="0"/>
-          <w:numId w:val="0"/>
-        </w:numPr>
-        <w:ind w:left="360" w:hanging="360"/>
-      </w:pPr>
-      <w:r>
-        <w:t>Facebook is a social networking site where millions of people</w:t>
-      </w:r>
-    </w:p>
-    <w:p>
-      <w:pPr>
-        <w:pStyle w:val="ListBullet"/>
-        <w:numPr>
-          <w:ilvl w:val="0"/>
-          <w:numId w:val="0"/>
-        </w:numPr>
-        <w:ind w:left="360" w:hanging="360"/>
-      </w:pPr>
-      <w:r>
-        <w:t xml:space="preserve">Meet and get to see each other on a daily basis. Twitter is another </w:t>
-      </w:r>
-    </w:p>
-    <w:p>
-      <w:pPr>
-        <w:pStyle w:val="ListBullet"/>
-        <w:numPr>
-          <w:ilvl w:val="0"/>
-          <w:numId w:val="0"/>
-        </w:numPr>
-        <w:ind w:left="360" w:hanging="360"/>
-      </w:pPr>
-      <w:r>
-        <w:t xml:space="preserve">Social networking site that features this advantage. Instagram is </w:t>
-      </w:r>
-    </w:p>
-    <w:p>
-      <w:pPr>
-        <w:pStyle w:val="ListBullet"/>
-        <w:numPr>
-          <w:ilvl w:val="0"/>
-          <w:numId w:val="0"/>
-        </w:numPr>
-        <w:ind w:left="360" w:hanging="360"/>
-      </w:pPr>
-      <w:r>
-        <w:t>Another site where your data is taken and stored and you can see</w:t>
-      </w:r>
-    </w:p>
-    <w:p>
-      <w:pPr>
-        <w:pStyle w:val="ListBullet"/>
-        <w:numPr>
-          <w:ilvl w:val="0"/>
-          <w:numId w:val="0"/>
-        </w:numPr>
-        <w:ind w:left="360" w:hanging="360"/>
-      </w:pPr>
-      <w:r>
-        <w:lastRenderedPageBreak/>
-        <w:t>Your friends daily.</w:t>
-      </w:r>
     </w:p>
     <w:sectPr>
       <w:footerReference w:type="default" r:id="rId9"/>

</xml_diff>